<commit_message>
Speaker script: fix swapped time labels
Co-Authored-By: Claude Opus 5.5 <noreply@anthropic.com>
</commit_message>
<xml_diff>
--- a/docs/Review-III/Speaker_Script.docx
+++ b/docs/Review-III/Speaker_Script.docx
@@ -229,7 +229,7 @@
         <w:rPr>
           <w:i/>
         </w:rPr>
-        <w:t>Slides 1–8 · opening, problem, related work, research gap · about 2 minutes</w:t>
+        <w:t>Slides 1–8 · opening, problem, related work, research gap · about 3 minutes</w:t>
       </w:r>
     </w:p>
     <w:p>
@@ -354,7 +354,7 @@
         <w:rPr>
           <w:i/>
         </w:rPr>
-        <w:t>Slides 9–11 · data, architecture, the application · about 3 minutes</w:t>
+        <w:t>Slides 9–11 · data, architecture, the application · about 2 minutes</w:t>
       </w:r>
     </w:p>
     <w:p>

</xml_diff>

<commit_message>
Speaker script: team lead opens and closes; PDF version
Jayakanth 1-3, Narendar 4-8, Praneeth 9-11, Jayakanth 12-13 + demo, Narendar 14-15, Jayakanth 16-18.

Co-Authored-By: Claude Opus 5.5 <noreply@anthropic.com>
</commit_message>
<xml_diff>
--- a/docs/Review-III/Speaker_Script.docx
+++ b/docs/Review-III/Speaker_Script.docx
@@ -73,6 +73,38 @@
           </w:tcPr>
           <w:p>
             <w:r>
+              <w:t>Jayakanth Kamisetti (team lead)</w:t>
+            </w:r>
+          </w:p>
+        </w:tc>
+        <w:tc>
+          <w:tcPr>
+            <w:tcW w:type="dxa" w:w="2880"/>
+          </w:tcPr>
+          <w:p>
+            <w:r>
+              <w:t>1–3: opening · 12–13 + live demo · 16–18: close; leads Q&amp;A</w:t>
+            </w:r>
+          </w:p>
+        </w:tc>
+        <w:tc>
+          <w:tcPr>
+            <w:tcW w:type="dxa" w:w="2880"/>
+          </w:tcPr>
+          <w:p>
+            <w:r>
+              <w:t>≈ 5 min + 5 min demo</w:t>
+            </w:r>
+          </w:p>
+        </w:tc>
+      </w:tr>
+      <w:tr>
+        <w:tc>
+          <w:tcPr>
+            <w:tcW w:type="dxa" w:w="2880"/>
+          </w:tcPr>
+          <w:p>
+            <w:r>
               <w:t>Boddupally Narendar</w:t>
             </w:r>
           </w:p>
@@ -83,7 +115,7 @@
           </w:tcPr>
           <w:p>
             <w:r>
-              <w:t>1–8: opening, problem, related papers, research gap</w:t>
+              <w:t>4–8: related papers, research gap · 14–15: limitations, future work</w:t>
             </w:r>
           </w:p>
         </w:tc>
@@ -93,7 +125,7 @@
           </w:tcPr>
           <w:p>
             <w:r>
-              <w:t>≈ 3 min</w:t>
+              <w:t>≈ 4 min</w:t>
             </w:r>
           </w:p>
         </w:tc>
@@ -126,38 +158,6 @@
           <w:p>
             <w:r>
               <w:t>≈ 2 min</w:t>
-            </w:r>
-          </w:p>
-        </w:tc>
-      </w:tr>
-      <w:tr>
-        <w:tc>
-          <w:tcPr>
-            <w:tcW w:type="dxa" w:w="2880"/>
-          </w:tcPr>
-          <w:p>
-            <w:r>
-              <w:t>Jayakanth Kamisetti</w:t>
-            </w:r>
-          </w:p>
-        </w:tc>
-        <w:tc>
-          <w:tcPr>
-            <w:tcW w:type="dxa" w:w="2880"/>
-          </w:tcPr>
-          <w:p>
-            <w:r>
-              <w:t>12–18 + live demo: results, demo, limitations, future work, close; leads Q&amp;A</w:t>
-            </w:r>
-          </w:p>
-        </w:tc>
-        <w:tc>
-          <w:tcPr>
-            <w:tcW w:type="dxa" w:w="2880"/>
-          </w:tcPr>
-          <w:p>
-            <w:r>
-              <w:t>≈ 4 min + 5 min demo</w:t>
             </w:r>
           </w:p>
         </w:tc>
@@ -212,6 +212,14 @@
       </w:r>
     </w:p>
     <w:p>
+      <w:pPr>
+        <w:pStyle w:val="ListBullet"/>
+      </w:pPr>
+      <w:r>
+        <w:t>Order: Jayakanth → Narendar → Praneeth → Jayakanth (results, demo) → Narendar → Jayakanth (close).</w:t>
+      </w:r>
+    </w:p>
+    <w:p>
       <w:r>
         <w:br w:type="page"/>
       </w:r>
@@ -221,7 +229,7 @@
         <w:pStyle w:val="Heading1"/>
       </w:pPr>
       <w:r>
-        <w:t>Boddupally Narendar</w:t>
+        <w:t>Part 1 · Opening — Jayakanth Kamisetti</w:t>
       </w:r>
     </w:p>
     <w:p>
@@ -229,7 +237,7 @@
         <w:rPr>
           <w:i/>
         </w:rPr>
-        <w:t>Slides 1–8 · opening, problem, related work, research gap · about 3 minutes</w:t>
+        <w:t>Part 1 · Opening — slides 1–3 · about 1.5 minutes</w:t>
       </w:r>
     </w:p>
     <w:p>
@@ -248,7 +256,7 @@
         <w:t xml:space="preserve">Say: </w:t>
       </w:r>
       <w:r>
-        <w:t>Good morning. We are Team 21. I am Boddupally Narendar, with Jayakanth Kamisetti and Praneeth Reddy, and our supervisor is M Parameswar, Associate Professor. Our project is QueryGenie: a self-correcting natural-language-to-SQL interface.</w:t>
+        <w:t>Good morning. I am Jayakanth Kamisetti, team lead of Team 21, with my teammates Boddupally Narendar and Praneeth Reddy. Our supervisor is M Parameswar, Associate Professor. Our project is QueryGenie: a self-correcting natural-language-to-SQL interface.</w:t>
       </w:r>
     </w:p>
     <w:p>
@@ -286,7 +294,28 @@
         <w:t xml:space="preserve">Say: </w:t>
       </w:r>
       <w:r>
-        <w:t>Most of an organisation's data lives in databases, and getting an answer out of them needs SQL. Text-to-SQL systems let you ask in plain English instead. The problem is that they answer every question with the same confidence, so a wrong answer looks exactly like a right one. Even CodeS, a strong open model, is wrong on about one in five questions of the standard Spider benchmark. And most strong systems use closed models like GPT-4, which means sending your database schema to a third party. Our goal: reproduce CodeS, an open model that runs locally, and make it say when it is unsure instead of answering wrongly.</w:t>
+        <w:t>Most of an organisation's data lives in databases, and getting an answer out of them needs SQL. Text-to-SQL systems let you ask in plain English instead. The problem is that they answer every question with the same confidence, so a wrong answer looks exactly like a right one. Even CodeS, a strong open model, is wrong on about one in five questions of the standard Spider benchmark. And most strong systems use closed models like GPT-4, which means sending your database schema to a third party. Our goal: reproduce CodeS, an open model that runs locally, and make it say when it is unsure instead of answering wrongly. Narendar will now take you through the research we built on.</w:t>
+      </w:r>
+    </w:p>
+    <w:p>
+      <w:r>
+        <w:br w:type="page"/>
+      </w:r>
+    </w:p>
+    <w:p>
+      <w:pPr>
+        <w:pStyle w:val="Heading1"/>
+      </w:pPr>
+      <w:r>
+        <w:t>Part 2 · Related work — Boddupally Narendar</w:t>
+      </w:r>
+    </w:p>
+    <w:p>
+      <w:r>
+        <w:rPr>
+          <w:i/>
+        </w:rPr>
+        <w:t>Part 2 · Related work — slides 4–8 · about 2.5 minutes</w:t>
       </w:r>
     </w:p>
     <w:p>
@@ -314,7 +343,7 @@
         <w:t xml:space="preserve">Say: </w:t>
       </w:r>
       <w:r>
-        <w:t>We reviewed sixteen papers, all from arXiv. On this slide: Seq2SQL and Spider started the field — Spider has over ten thousand questions on two hundred databases, and the best model at the time got only 12.4 percent. Next slide: neural approaches like BRIDGE, which adds matching database values to the input, and PICARD, which forces the model to write valid SQL. Then the large-language-model era: DIN-SQL adds self-correction and reaches 85.3 percent on Spider's test set; BIRD shows that on large real-world databases even ChatGPT gets only about 40 percent, against 93 percent for humans. On the last slide: CHESS and CHASE-SQL, and CodeS — the paper we reproduce — open models from one to fifteen billion parameters; CodeS-1B reports 77.9 percent on Spider.</w:t>
+        <w:t>Thank you. We reviewed sixteen papers, all from arXiv. On this slide: Seq2SQL and Spider started the field — Spider has over ten thousand questions on two hundred databases, and the best model at the time got only 12.4 percent. Next slide: neural approaches like BRIDGE, which adds matching database values to the input, and PICARD, which forces the model to write valid SQL. Then the large-language-model era: DIN-SQL adds self-correction and reaches 85.3 percent on Spider's test set; BIRD shows that on large real-world databases even ChatGPT gets only about 40 percent, against 93 percent for humans. On the last slide: CHESS and CHASE-SQL, and CodeS — the paper we reproduce — open models from one to fifteen billion parameters; CodeS-1B reports 77.9 percent on Spider.</w:t>
       </w:r>
     </w:p>
     <w:p>
@@ -346,7 +375,7 @@
         <w:pStyle w:val="Heading1"/>
       </w:pPr>
       <w:r>
-        <w:t>M Praneeth Reddy</w:t>
+        <w:t>Part 3 · Method — M Praneeth Reddy</w:t>
       </w:r>
     </w:p>
     <w:p>
@@ -354,7 +383,7 @@
         <w:rPr>
           <w:i/>
         </w:rPr>
-        <w:t>Slides 9–11 · data, architecture, the application · about 2 minutes</w:t>
+        <w:t>Part 3 · Method — slides 9–11 · about 2 minutes</w:t>
       </w:r>
     </w:p>
     <w:p>
@@ -373,7 +402,7 @@
         <w:t xml:space="preserve">Say: </w:t>
       </w:r>
       <w:r>
-        <w:t>All our data comes from Hugging Face, which is on the department's approved list — no Kaggle. Our main benchmark is the Spider development set: 1,034 questions on 20 databases the model has never seen. About 40 percent of the questions need a join between tables. We also use Spider-Realistic: 508 of the same questions reworded so they don't mention the column names, the way real users talk. And we set up BIRD Mini-Dev, 500 questions on eleven large real-world databases.</w:t>
+        <w:t>Thank you, Narendar. All our data comes from Hugging Face, which is on the department's approved list — no Kaggle. Our main benchmark is the Spider development set: 1,034 questions on 20 databases the model has never seen. About 40 percent of the questions need a join between tables. We also use Spider-Realistic: 508 of the same questions reworded so they don't mention the column names, the way real users talk. And we set up BIRD Mini-Dev, 500 questions on eleven large real-world databases.</w:t>
       </w:r>
     </w:p>
     <w:p>
@@ -433,7 +462,7 @@
         <w:pStyle w:val="Heading1"/>
       </w:pPr>
       <w:r>
-        <w:t>Jayakanth Kamisetti</w:t>
+        <w:t>Part 4 · Results and live demo — Jayakanth Kamisetti</w:t>
       </w:r>
     </w:p>
     <w:p>
@@ -441,7 +470,7 @@
         <w:rPr>
           <w:i/>
         </w:rPr>
-        <w:t>Slides 12–18 + live demo · results, demo, limitations, future work, close · about 4 minutes + 5-minute demo</w:t>
+        <w:t>Part 4 · Results and live demo — slides 12–13 + demo · about 3 minutes + 5-minute demo</w:t>
       </w:r>
     </w:p>
     <w:p>
@@ -460,7 +489,7 @@
         <w:t xml:space="preserve">Say: </w:t>
       </w:r>
       <w:r>
-        <w:t>First, the reproduction. With the paper's own official evaluator we get 77.8 percent execution accuracy on Spider, against 77.9 percent in the paper — within 0.1 points, on a free Colab GPU instead of the authors' eight A800s. The ablation shows every part of the prompt matters: removing any one costs 0.9 to 1.9 points. Then our enhancement, on the same 1,034 questions: it answers 90.4 percent of them, and on those it is right 83.3 percent of the time, against 77.8 percent. Wrong answers drop from 230 to 156 — about a third. The paired t-test gives p of 7.7 times ten to the minus ten, and the Wilcoxon test agrees. And the signal is calibrated: when only one of four queries agrees, it is right 57 percent of the time; when all four agree, 88 percent.</w:t>
+        <w:t>Thank you, Praneeth. First, the reproduction. With the paper's own official evaluator we get 77.8 percent execution accuracy on Spider, against 77.9 percent in the paper — within 0.1 points, on a free Colab GPU instead of the authors' eight A800s. The ablation shows every part of the prompt matters: removing any one costs 0.9 to 1.9 points. Then our enhancement, on the same 1,034 questions: it answers 90.4 percent of them, and on those it is right 83.3 percent of the time, against 77.8 percent. Wrong answers drop from 230 to 156 — about a third. The paired t-test gives p of 7.7 times ten to the minus ten, and the Wilcoxon test agrees. And the signal is calibrated: when only one of four queries agrees, it is right 57 percent of the time; when all four agree, 88 percent.</w:t>
       </w:r>
     </w:p>
     <w:p>
@@ -507,7 +536,28 @@
         <w:t xml:space="preserve">Say: </w:t>
       </w:r>
       <w:r>
-        <w:t>Ask: 'List the subjects and the average marks for each subject.' — four of four agree, open the chart. Then: 'Who topped each subject?' — it says it is not sure and shows the readings: this is our enhancement. Then 'show me all' — it asks 'all of what?'. Then open the Map.</w:t>
+        <w:t>Ask: 'List the subjects and the average marks for each subject.' — four of four agree, open the chart. Then: 'Who topped each subject?' — it says it is not sure and shows the readings: this is our enhancement. Then 'show me all' — it asks 'all of what?'. Then open the Map. Back to the slides: Narendar will cover the limitations and what comes next.</w:t>
+      </w:r>
+    </w:p>
+    <w:p>
+      <w:r>
+        <w:br w:type="page"/>
+      </w:r>
+    </w:p>
+    <w:p>
+      <w:pPr>
+        <w:pStyle w:val="Heading1"/>
+      </w:pPr>
+      <w:r>
+        <w:t>Part 5 · Limitations and future work — Boddupally Narendar</w:t>
+      </w:r>
+    </w:p>
+    <w:p>
+      <w:r>
+        <w:rPr>
+          <w:i/>
+        </w:rPr>
+        <w:t>Part 5 · Limitations and future work — slides 14–15 · about 1.5 minutes</w:t>
       </w:r>
     </w:p>
     <w:p>
@@ -526,7 +576,7 @@
         <w:t xml:space="preserve">Say: </w:t>
       </w:r>
       <w:r>
-        <w:t>To be clear about the limits: overall accuracy is unchanged at 77.8 percent — we are right more often when we answer by declining about ten percent of questions. Agreement is not proof: about 12 percent of answers where all four agree are still wrong. The threshold was tuned on Spider with CodeS-1B. CodeS answers one question at a time, so follow-ups need a chat model. And we reproduced inference only, because pre-training needs eight A800 GPUs.</w:t>
+        <w:t>Thank you. To be clear about the limits: overall accuracy is unchanged at 77.8 percent — we are right more often when we answer by declining about ten percent of questions. Agreement is not proof: about 12 percent of answers where all four agree are still wrong. The threshold was tuned on Spider with CodeS-1B. CodeS answers one question at a time, so follow-ups need a chat model. And we reproduced inference only, because pre-training needs eight A800 GPUs.</w:t>
       </w:r>
     </w:p>
     <w:p>
@@ -545,7 +595,28 @@
         <w:t xml:space="preserve">Say: </w:t>
       </w:r>
       <w:r>
-        <w:t>In short: we reproduced CodeS within 0.1 points, made it say when it is unsure — 83.3 percent correct when it answers, a third fewer wrong answers, statistically significant — and delivered it as a local desktop app. Next, on the research side: CodeS-3B, a reranker — a correct query is among the four for 83 percent of questions — and calibration on real-world data. On the product side, we want to turn it into a platform companies can plug into any database, with access control and adaptation to each database, still running locally.</w:t>
+        <w:t>In short: we reproduced CodeS within 0.1 points, made it say when it is unsure — 83.3 percent correct when it answers, a third fewer wrong answers, statistically significant — and delivered it as a local desktop app. Next, on the research side: CodeS-3B, a reranker — a correct query is among the four for 83 percent of questions — and calibration on real-world data. On the product side, we want to turn it into a platform companies can plug into any database, with access control and adaptation to each database, still running locally. Jayakanth will close.</w:t>
+      </w:r>
+    </w:p>
+    <w:p>
+      <w:r>
+        <w:br w:type="page"/>
+      </w:r>
+    </w:p>
+    <w:p>
+      <w:pPr>
+        <w:pStyle w:val="Heading1"/>
+      </w:pPr>
+      <w:r>
+        <w:t>Part 6 · Close and Q&amp;A — Jayakanth Kamisetti</w:t>
+      </w:r>
+    </w:p>
+    <w:p>
+      <w:r>
+        <w:rPr>
+          <w:i/>
+        </w:rPr>
+        <w:t>Part 6 · Close and Q&amp;A — slides 16–18</w:t>
       </w:r>
     </w:p>
     <w:p>
@@ -583,7 +654,7 @@
         <w:t xml:space="preserve">Say: </w:t>
       </w:r>
       <w:r>
-        <w:t>Thank you. We are happy to take your questions.</w:t>
+        <w:t>Thank you. We are happy to take your questions — I'll direct each question to the right teammate.</w:t>
       </w:r>
     </w:p>
     <w:p>

</xml_diff>

<commit_message>
Team number is now 18 (renumbered from 21)
Updated the README, NOTICE, PRODUCT.md, CLAUDE.md, notebooks, run-log header, speaker script; added
"Team 18" to the deck's title slide and the poster's team details. Documents submitted before the
change (e.g. Week 1/Team_21.pptx, the reproducibility reports) are left as they were; the app's
internal bundle identifier is unchanged.

Co-Authored-By: Claude Opus 5.5 <noreply@anthropic.com>
</commit_message>
<xml_diff>
--- a/docs/Review-III/Speaker_Script.docx
+++ b/docs/Review-III/Speaker_Script.docx
@@ -12,7 +12,7 @@
     </w:p>
     <w:p>
       <w:r>
-        <w:t>Team 21 · Supervisor: M Parameswar, Associate Professor · Deck: QueryGenie_Review-III.pptx (18 slides)</w:t>
+        <w:t>Team 18 · Supervisor: M Parameswar, Associate Professor · Deck: QueryGenie_Review-III.pptx (18 slides)</w:t>
       </w:r>
     </w:p>
     <w:p>
@@ -256,7 +256,7 @@
         <w:t xml:space="preserve">Say: </w:t>
       </w:r>
       <w:r>
-        <w:t>Good morning. I am Jayakanth Kamisetti, team lead of Team 21, with my teammates Boddupally Narendar and Praneeth Reddy. Our supervisor is M Parameswar, Associate Professor. Our project is QueryGenie: a self-correcting natural-language-to-SQL interface.</w:t>
+        <w:t>Good morning. I am Jayakanth Kamisetti, team lead of Team 18, with my teammates Boddupally Narendar and Praneeth Reddy. Our supervisor is M Parameswar, Associate Professor. Our project is QueryGenie: a self-correcting natural-language-to-SQL interface.</w:t>
       </w:r>
     </w:p>
     <w:p>

</xml_diff>